<commit_message>
Name the flow 5 loop item so it works in either designer
Co-Authored-By: Claude Opus 5.5 <noreply@anthropic.com>
Claude-Session: https://claude.ai/code/session_0179JD8tKBuQw572uHNzHE2b
</commit_message>
<xml_diff>
--- a/docs/word/9 - Saving and Reopening Variation Files.docx
+++ b/docs/word/9 - Saving and Reopening Variation Files.docx
@@ -2013,16 +2013,16 @@
           <w:sz w:val="20"/>
           <w:szCs w:val="20"/>
         </w:rPr>
-        <w:t xml:space="preserve">SharePoint → Delete attachment</w:t>
-      </w:r>
-      <w:r>
-        <w:rPr>
-          <w:rFonts w:ascii="Arial" w:cs="Arial" w:eastAsia="Arial" w:hAnsi="Arial"/>
-          <w:color w:val="1C2B3A"/>
-          <w:sz w:val="20"/>
-          <w:szCs w:val="20"/>
-        </w:rPr>
-        <w:t xml:space="preserve">, which goes inside an </w:t>
+        <w:t xml:space="preserve">Control → Apply to each</w:t>
+      </w:r>
+      <w:r>
+        <w:rPr>
+          <w:rFonts w:ascii="Arial" w:cs="Arial" w:eastAsia="Arial" w:hAnsi="Arial"/>
+          <w:color w:val="1C2B3A"/>
+          <w:sz w:val="20"/>
+          <w:szCs w:val="20"/>
+        </w:rPr>
+        <w:t xml:space="preserve"> (the new designer calls it </w:t>
       </w:r>
       <w:r>
         <w:rPr>
@@ -2033,16 +2033,16 @@
           <w:sz w:val="20"/>
           <w:szCs w:val="20"/>
         </w:rPr>
-        <w:t xml:space="preserve">Apply to each</w:t>
-      </w:r>
-      <w:r>
-        <w:rPr>
-          <w:rFonts w:ascii="Arial" w:cs="Arial" w:eastAsia="Arial" w:hAnsi="Arial"/>
-          <w:color w:val="1C2B3A"/>
-          <w:sz w:val="20"/>
-          <w:szCs w:val="20"/>
-        </w:rPr>
-        <w:t xml:space="preserve"> over </w:t>
+        <w:t xml:space="preserve">For each</w:t>
+      </w:r>
+      <w:r>
+        <w:rPr>
+          <w:rFonts w:ascii="Arial" w:cs="Arial" w:eastAsia="Arial" w:hAnsi="Arial"/>
+          <w:color w:val="1C2B3A"/>
+          <w:sz w:val="20"/>
+          <w:szCs w:val="20"/>
+        </w:rPr>
+        <w:t xml:space="preserve">) over </w:t>
       </w:r>
       <w:r>
         <w:rPr>
@@ -2061,6 +2061,26 @@
           <w:sz w:val="20"/>
           <w:szCs w:val="20"/>
         </w:rPr>
+        <w:t xml:space="preserve">, and inside it </w:t>
+      </w:r>
+      <w:r>
+        <w:rPr>
+          <w:rFonts w:ascii="Arial" w:cs="Arial" w:eastAsia="Arial" w:hAnsi="Arial"/>
+          <w:b/>
+          <w:bCs/>
+          <w:color w:val="1C2B3A"/>
+          <w:sz w:val="20"/>
+          <w:szCs w:val="20"/>
+        </w:rPr>
+        <w:t xml:space="preserve">SharePoint → Delete attachment</w:t>
+      </w:r>
+      <w:r>
+        <w:rPr>
+          <w:rFonts w:ascii="Arial" w:cs="Arial" w:eastAsia="Arial" w:hAnsi="Arial"/>
+          <w:color w:val="1C2B3A"/>
+          <w:sz w:val="20"/>
+          <w:szCs w:val="20"/>
+        </w:rPr>
         <w:t xml:space="preserve"> — Site Address and List Name as above, </w:t>
       </w:r>
       <w:r>
@@ -2111,7 +2131,7 @@
           <w:szCs w:val="18"/>
           <w:shd w:fill="F2F0EA" w:val="clear"/>
         </w:rPr>
-        <w:t xml:space="preserve">@{items('Apply_to_each')?['Id']}</w:t>
+        <w:t xml:space="preserve">@{item()?['Id']}</w:t>
       </w:r>
     </w:p>
     <w:p>
@@ -2184,27 +2204,7 @@
           <w:sz w:val="20"/>
           <w:szCs w:val="20"/>
         </w:rPr>
-        <w:t xml:space="preserve">, after the </w:t>
-      </w:r>
-      <w:r>
-        <w:rPr>
-          <w:rFonts w:ascii="Arial" w:cs="Arial" w:eastAsia="Arial" w:hAnsi="Arial"/>
-          <w:i/>
-          <w:iCs/>
-          <w:color w:val="1C2B3A"/>
-          <w:sz w:val="20"/>
-          <w:szCs w:val="20"/>
-        </w:rPr>
-        <w:t xml:space="preserve">Apply to each</w:t>
-      </w:r>
-      <w:r>
-        <w:rPr>
-          <w:rFonts w:ascii="Arial" w:cs="Arial" w:eastAsia="Arial" w:hAnsi="Arial"/>
-          <w:color w:val="1C2B3A"/>
-          <w:sz w:val="20"/>
-          <w:szCs w:val="20"/>
-        </w:rPr>
-        <w:t xml:space="preserve">: </w:t>
+        <w:t xml:space="preserve">, after the loop (not inside it): </w:t>
       </w:r>
       <w:r>
         <w:rPr>

</xml_diff>